<commit_message>
suawr l;aij phaanf taoj baif tap
</commit_message>
<xml_diff>
--- a/public/form-cau-hoi-mau.docx
+++ b/public/form-cau-hoi-mau.docx
@@ -35,277 +35,7 @@
           <w:sz w:val="24"/>
           <w:szCs w:val="24"/>
         </w:rPr>
-        <w:t xml:space="preserve">Theo </w:t>
-      </w:r>
-      <w:proofErr w:type="spellStart"/>
-      <w:r>
-        <w:rPr>
-          <w:rFonts w:ascii="Times New Roman" w:hAnsi="Times New Roman" w:cs="Times New Roman"/>
-          <w:sz w:val="24"/>
-          <w:szCs w:val="24"/>
-        </w:rPr>
-        <w:t>thống</w:t>
-      </w:r>
-      <w:proofErr w:type="spellEnd"/>
-      <w:r>
-        <w:rPr>
-          <w:rFonts w:ascii="Times New Roman" w:hAnsi="Times New Roman" w:cs="Times New Roman"/>
-          <w:sz w:val="24"/>
-          <w:szCs w:val="24"/>
-        </w:rPr>
-        <w:t xml:space="preserve"> </w:t>
-      </w:r>
-      <w:proofErr w:type="spellStart"/>
-      <w:r>
-        <w:rPr>
-          <w:rFonts w:ascii="Times New Roman" w:hAnsi="Times New Roman" w:cs="Times New Roman"/>
-          <w:sz w:val="24"/>
-          <w:szCs w:val="24"/>
-        </w:rPr>
-        <w:t>kê</w:t>
-      </w:r>
-      <w:proofErr w:type="spellEnd"/>
-      <w:r>
-        <w:rPr>
-          <w:rFonts w:ascii="Times New Roman" w:hAnsi="Times New Roman" w:cs="Times New Roman"/>
-          <w:sz w:val="24"/>
-          <w:szCs w:val="24"/>
-        </w:rPr>
-        <w:t xml:space="preserve"> </w:t>
-      </w:r>
-      <w:proofErr w:type="spellStart"/>
-      <w:r>
-        <w:rPr>
-          <w:rFonts w:ascii="Times New Roman" w:hAnsi="Times New Roman" w:cs="Times New Roman"/>
-          <w:sz w:val="24"/>
-          <w:szCs w:val="24"/>
-        </w:rPr>
-        <w:t>cuối</w:t>
-      </w:r>
-      <w:proofErr w:type="spellEnd"/>
-      <w:r>
-        <w:rPr>
-          <w:rFonts w:ascii="Times New Roman" w:hAnsi="Times New Roman" w:cs="Times New Roman"/>
-          <w:sz w:val="24"/>
-          <w:szCs w:val="24"/>
-        </w:rPr>
-        <w:t xml:space="preserve"> </w:t>
-      </w:r>
-      <w:proofErr w:type="spellStart"/>
-      <w:r>
-        <w:rPr>
-          <w:rFonts w:ascii="Times New Roman" w:hAnsi="Times New Roman" w:cs="Times New Roman"/>
-          <w:sz w:val="24"/>
-          <w:szCs w:val="24"/>
-        </w:rPr>
-        <w:t>kì</w:t>
-      </w:r>
-      <w:proofErr w:type="spellEnd"/>
-      <w:r>
-        <w:rPr>
-          <w:rFonts w:ascii="Times New Roman" w:hAnsi="Times New Roman" w:cs="Times New Roman"/>
-          <w:sz w:val="24"/>
-          <w:szCs w:val="24"/>
-        </w:rPr>
-        <w:t xml:space="preserve"> I </w:t>
-      </w:r>
-      <w:proofErr w:type="spellStart"/>
-      <w:r>
-        <w:rPr>
-          <w:rFonts w:ascii="Times New Roman" w:hAnsi="Times New Roman" w:cs="Times New Roman"/>
-          <w:sz w:val="24"/>
-          <w:szCs w:val="24"/>
-        </w:rPr>
-        <w:t>của</w:t>
-      </w:r>
-      <w:proofErr w:type="spellEnd"/>
-      <w:r>
-        <w:rPr>
-          <w:rFonts w:ascii="Times New Roman" w:hAnsi="Times New Roman" w:cs="Times New Roman"/>
-          <w:sz w:val="24"/>
-          <w:szCs w:val="24"/>
-        </w:rPr>
-        <w:t xml:space="preserve"> </w:t>
-      </w:r>
-      <w:proofErr w:type="spellStart"/>
-      <w:r>
-        <w:rPr>
-          <w:rFonts w:ascii="Times New Roman" w:hAnsi="Times New Roman" w:cs="Times New Roman"/>
-          <w:sz w:val="24"/>
-          <w:szCs w:val="24"/>
-        </w:rPr>
-        <w:t>lớp</w:t>
-      </w:r>
-      <w:proofErr w:type="spellEnd"/>
-      <w:r>
-        <w:rPr>
-          <w:rFonts w:ascii="Times New Roman" w:hAnsi="Times New Roman" w:cs="Times New Roman"/>
-          <w:sz w:val="24"/>
-          <w:szCs w:val="24"/>
-        </w:rPr>
-        <w:t xml:space="preserve"> 7A </w:t>
-      </w:r>
-      <w:proofErr w:type="spellStart"/>
-      <w:r>
-        <w:rPr>
-          <w:rFonts w:ascii="Times New Roman" w:hAnsi="Times New Roman" w:cs="Times New Roman"/>
-          <w:sz w:val="24"/>
-          <w:szCs w:val="24"/>
-        </w:rPr>
-        <w:t>về</w:t>
-      </w:r>
-      <w:proofErr w:type="spellEnd"/>
-      <w:r>
-        <w:rPr>
-          <w:rFonts w:ascii="Times New Roman" w:hAnsi="Times New Roman" w:cs="Times New Roman"/>
-          <w:sz w:val="24"/>
-          <w:szCs w:val="24"/>
-        </w:rPr>
-        <w:t xml:space="preserve"> </w:t>
-      </w:r>
-      <w:proofErr w:type="spellStart"/>
-      <w:r>
-        <w:rPr>
-          <w:rFonts w:ascii="Times New Roman" w:hAnsi="Times New Roman" w:cs="Times New Roman"/>
-          <w:sz w:val="24"/>
-          <w:szCs w:val="24"/>
-        </w:rPr>
-        <w:t>xếp</w:t>
-      </w:r>
-      <w:proofErr w:type="spellEnd"/>
-      <w:r>
-        <w:rPr>
-          <w:rFonts w:ascii="Times New Roman" w:hAnsi="Times New Roman" w:cs="Times New Roman"/>
-          <w:sz w:val="24"/>
-          <w:szCs w:val="24"/>
-        </w:rPr>
-        <w:t xml:space="preserve"> </w:t>
-      </w:r>
-      <w:proofErr w:type="spellStart"/>
-      <w:r>
-        <w:rPr>
-          <w:rFonts w:ascii="Times New Roman" w:hAnsi="Times New Roman" w:cs="Times New Roman"/>
-          <w:sz w:val="24"/>
-          <w:szCs w:val="24"/>
-        </w:rPr>
-        <w:t>loại</w:t>
-      </w:r>
-      <w:proofErr w:type="spellEnd"/>
-      <w:r>
-        <w:rPr>
-          <w:rFonts w:ascii="Times New Roman" w:hAnsi="Times New Roman" w:cs="Times New Roman"/>
-          <w:sz w:val="24"/>
-          <w:szCs w:val="24"/>
-        </w:rPr>
-        <w:t xml:space="preserve"> </w:t>
-      </w:r>
-      <w:proofErr w:type="spellStart"/>
-      <w:r>
-        <w:rPr>
-          <w:rFonts w:ascii="Times New Roman" w:hAnsi="Times New Roman" w:cs="Times New Roman"/>
-          <w:sz w:val="24"/>
-          <w:szCs w:val="24"/>
-        </w:rPr>
-        <w:t>hạnh</w:t>
-      </w:r>
-      <w:proofErr w:type="spellEnd"/>
-      <w:r>
-        <w:rPr>
-          <w:rFonts w:ascii="Times New Roman" w:hAnsi="Times New Roman" w:cs="Times New Roman"/>
-          <w:sz w:val="24"/>
-          <w:szCs w:val="24"/>
-        </w:rPr>
-        <w:t xml:space="preserve"> </w:t>
-      </w:r>
-      <w:proofErr w:type="spellStart"/>
-      <w:r>
-        <w:rPr>
-          <w:rFonts w:ascii="Times New Roman" w:hAnsi="Times New Roman" w:cs="Times New Roman"/>
-          <w:sz w:val="24"/>
-          <w:szCs w:val="24"/>
-        </w:rPr>
-        <w:t>kiểm</w:t>
-      </w:r>
-      <w:proofErr w:type="spellEnd"/>
-      <w:r>
-        <w:rPr>
-          <w:rFonts w:ascii="Times New Roman" w:hAnsi="Times New Roman" w:cs="Times New Roman"/>
-          <w:sz w:val="24"/>
-          <w:szCs w:val="24"/>
-        </w:rPr>
-        <w:t xml:space="preserve"> </w:t>
-      </w:r>
-      <w:proofErr w:type="spellStart"/>
-      <w:r>
-        <w:rPr>
-          <w:rFonts w:ascii="Times New Roman" w:hAnsi="Times New Roman" w:cs="Times New Roman"/>
-          <w:sz w:val="24"/>
-          <w:szCs w:val="24"/>
-        </w:rPr>
-        <w:t>cho</w:t>
-      </w:r>
-      <w:proofErr w:type="spellEnd"/>
-      <w:r>
-        <w:rPr>
-          <w:rFonts w:ascii="Times New Roman" w:hAnsi="Times New Roman" w:cs="Times New Roman"/>
-          <w:sz w:val="24"/>
-          <w:szCs w:val="24"/>
-        </w:rPr>
-        <w:t xml:space="preserve"> </w:t>
-      </w:r>
-      <w:proofErr w:type="spellStart"/>
-      <w:r>
-        <w:rPr>
-          <w:rFonts w:ascii="Times New Roman" w:hAnsi="Times New Roman" w:cs="Times New Roman"/>
-          <w:sz w:val="24"/>
-          <w:szCs w:val="24"/>
-        </w:rPr>
-        <w:t>bởi</w:t>
-      </w:r>
-      <w:proofErr w:type="spellEnd"/>
-      <w:r>
-        <w:rPr>
-          <w:rFonts w:ascii="Times New Roman" w:hAnsi="Times New Roman" w:cs="Times New Roman"/>
-          <w:sz w:val="24"/>
-          <w:szCs w:val="24"/>
-        </w:rPr>
-        <w:t xml:space="preserve"> </w:t>
-      </w:r>
-      <w:proofErr w:type="spellStart"/>
-      <w:r>
-        <w:rPr>
-          <w:rFonts w:ascii="Times New Roman" w:hAnsi="Times New Roman" w:cs="Times New Roman"/>
-          <w:sz w:val="24"/>
-          <w:szCs w:val="24"/>
-        </w:rPr>
-        <w:t>bảng</w:t>
-      </w:r>
-      <w:proofErr w:type="spellEnd"/>
-      <w:r>
-        <w:rPr>
-          <w:rFonts w:ascii="Times New Roman" w:hAnsi="Times New Roman" w:cs="Times New Roman"/>
-          <w:sz w:val="24"/>
-          <w:szCs w:val="24"/>
-        </w:rPr>
-        <w:t xml:space="preserve"> </w:t>
-      </w:r>
-      <w:proofErr w:type="spellStart"/>
-      <w:r>
-        <w:rPr>
-          <w:rFonts w:ascii="Times New Roman" w:hAnsi="Times New Roman" w:cs="Times New Roman"/>
-          <w:sz w:val="24"/>
-          <w:szCs w:val="24"/>
-        </w:rPr>
-        <w:t>sau</w:t>
-      </w:r>
-      <w:proofErr w:type="spellEnd"/>
-      <w:r>
-        <w:rPr>
-          <w:rFonts w:ascii="Times New Roman" w:hAnsi="Times New Roman" w:cs="Times New Roman"/>
-          <w:sz w:val="24"/>
-          <w:szCs w:val="24"/>
-        </w:rPr>
-        <w:t xml:space="preserve">: </w:t>
+        <w:t xml:space="preserve">Theo thống kê cuối kì I của lớp 7A về xếp loại hạnh kiểm cho bởi bảng sau: </w:t>
       </w:r>
     </w:p>
     <w:tbl>
@@ -337,70 +67,14 @@
                 <w:szCs w:val="24"/>
               </w:rPr>
             </w:pPr>
-            <w:proofErr w:type="spellStart"/>
             <w:r>
               <w:rPr>
                 <w:rFonts w:ascii="Times New Roman" w:eastAsia="Times New Roman" w:hAnsi="Times New Roman" w:cs="Times New Roman"/>
                 <w:sz w:val="24"/>
                 <w:szCs w:val="24"/>
               </w:rPr>
-              <w:t>Xếp</w:t>
+              <w:t>Xếp loại hạnh kiểm</w:t>
             </w:r>
-            <w:proofErr w:type="spellEnd"/>
-            <w:r>
-              <w:rPr>
-                <w:rFonts w:ascii="Times New Roman" w:eastAsia="Times New Roman" w:hAnsi="Times New Roman" w:cs="Times New Roman"/>
-                <w:sz w:val="24"/>
-                <w:szCs w:val="24"/>
-              </w:rPr>
-              <w:t xml:space="preserve"> </w:t>
-            </w:r>
-            <w:proofErr w:type="spellStart"/>
-            <w:r>
-              <w:rPr>
-                <w:rFonts w:ascii="Times New Roman" w:eastAsia="Times New Roman" w:hAnsi="Times New Roman" w:cs="Times New Roman"/>
-                <w:sz w:val="24"/>
-                <w:szCs w:val="24"/>
-              </w:rPr>
-              <w:t>loại</w:t>
-            </w:r>
-            <w:proofErr w:type="spellEnd"/>
-            <w:r>
-              <w:rPr>
-                <w:rFonts w:ascii="Times New Roman" w:eastAsia="Times New Roman" w:hAnsi="Times New Roman" w:cs="Times New Roman"/>
-                <w:sz w:val="24"/>
-                <w:szCs w:val="24"/>
-              </w:rPr>
-              <w:t xml:space="preserve"> </w:t>
-            </w:r>
-            <w:proofErr w:type="spellStart"/>
-            <w:r>
-              <w:rPr>
-                <w:rFonts w:ascii="Times New Roman" w:eastAsia="Times New Roman" w:hAnsi="Times New Roman" w:cs="Times New Roman"/>
-                <w:sz w:val="24"/>
-                <w:szCs w:val="24"/>
-              </w:rPr>
-              <w:t>hạnh</w:t>
-            </w:r>
-            <w:proofErr w:type="spellEnd"/>
-            <w:r>
-              <w:rPr>
-                <w:rFonts w:ascii="Times New Roman" w:eastAsia="Times New Roman" w:hAnsi="Times New Roman" w:cs="Times New Roman"/>
-                <w:sz w:val="24"/>
-                <w:szCs w:val="24"/>
-              </w:rPr>
-              <w:t xml:space="preserve"> </w:t>
-            </w:r>
-            <w:proofErr w:type="spellStart"/>
-            <w:r>
-              <w:rPr>
-                <w:rFonts w:ascii="Times New Roman" w:eastAsia="Times New Roman" w:hAnsi="Times New Roman" w:cs="Times New Roman"/>
-                <w:sz w:val="24"/>
-                <w:szCs w:val="24"/>
-              </w:rPr>
-              <w:t>kiểm</w:t>
-            </w:r>
-            <w:proofErr w:type="spellEnd"/>
           </w:p>
         </w:tc>
         <w:tc>
@@ -417,7 +91,6 @@
                 <w:szCs w:val="24"/>
               </w:rPr>
             </w:pPr>
-            <w:proofErr w:type="spellStart"/>
             <w:r>
               <w:rPr>
                 <w:rFonts w:ascii="Times New Roman" w:eastAsia="Times New Roman" w:hAnsi="Times New Roman" w:cs="Times New Roman"/>
@@ -426,7 +99,6 @@
               </w:rPr>
               <w:t>Tốt</w:t>
             </w:r>
-            <w:proofErr w:type="spellEnd"/>
           </w:p>
         </w:tc>
         <w:tc>
@@ -443,7 +115,6 @@
                 <w:szCs w:val="24"/>
               </w:rPr>
             </w:pPr>
-            <w:proofErr w:type="spellStart"/>
             <w:r>
               <w:rPr>
                 <w:rFonts w:ascii="Times New Roman" w:eastAsia="Times New Roman" w:hAnsi="Times New Roman" w:cs="Times New Roman"/>
@@ -452,7 +123,6 @@
               </w:rPr>
               <w:t>Khá</w:t>
             </w:r>
-            <w:proofErr w:type="spellEnd"/>
           </w:p>
         </w:tc>
         <w:tc>
@@ -475,18 +145,8 @@
                 <w:sz w:val="24"/>
                 <w:szCs w:val="24"/>
               </w:rPr>
-              <w:t xml:space="preserve">Trung </w:t>
+              <w:t>Trung bình</w:t>
             </w:r>
-            <w:proofErr w:type="spellStart"/>
-            <w:r>
-              <w:rPr>
-                <w:rFonts w:ascii="Times New Roman" w:eastAsia="Times New Roman" w:hAnsi="Times New Roman" w:cs="Times New Roman"/>
-                <w:sz w:val="24"/>
-                <w:szCs w:val="24"/>
-              </w:rPr>
-              <w:t>bình</w:t>
-            </w:r>
-            <w:proofErr w:type="spellEnd"/>
           </w:p>
         </w:tc>
         <w:tc>
@@ -503,7 +163,6 @@
                 <w:szCs w:val="24"/>
               </w:rPr>
             </w:pPr>
-            <w:proofErr w:type="spellStart"/>
             <w:r>
               <w:rPr>
                 <w:rFonts w:ascii="Times New Roman" w:eastAsia="Times New Roman" w:hAnsi="Times New Roman" w:cs="Times New Roman"/>
@@ -512,7 +171,6 @@
               </w:rPr>
               <w:t>Yếu</w:t>
             </w:r>
-            <w:proofErr w:type="spellEnd"/>
           </w:p>
         </w:tc>
       </w:tr>
@@ -531,106 +189,14 @@
                 <w:szCs w:val="24"/>
               </w:rPr>
             </w:pPr>
-            <w:proofErr w:type="spellStart"/>
             <w:r>
               <w:rPr>
                 <w:rFonts w:ascii="Times New Roman" w:eastAsia="Times New Roman" w:hAnsi="Times New Roman" w:cs="Times New Roman"/>
                 <w:sz w:val="24"/>
                 <w:szCs w:val="24"/>
               </w:rPr>
-              <w:t>Số</w:t>
+              <w:t>Số học sinh được đánh giá</w:t>
             </w:r>
-            <w:proofErr w:type="spellEnd"/>
-            <w:r>
-              <w:rPr>
-                <w:rFonts w:ascii="Times New Roman" w:eastAsia="Times New Roman" w:hAnsi="Times New Roman" w:cs="Times New Roman"/>
-                <w:sz w:val="24"/>
-                <w:szCs w:val="24"/>
-              </w:rPr>
-              <w:t xml:space="preserve"> </w:t>
-            </w:r>
-            <w:proofErr w:type="spellStart"/>
-            <w:r>
-              <w:rPr>
-                <w:rFonts w:ascii="Times New Roman" w:eastAsia="Times New Roman" w:hAnsi="Times New Roman" w:cs="Times New Roman"/>
-                <w:sz w:val="24"/>
-                <w:szCs w:val="24"/>
-              </w:rPr>
-              <w:t>học</w:t>
-            </w:r>
-            <w:proofErr w:type="spellEnd"/>
-            <w:r>
-              <w:rPr>
-                <w:rFonts w:ascii="Times New Roman" w:eastAsia="Times New Roman" w:hAnsi="Times New Roman" w:cs="Times New Roman"/>
-                <w:sz w:val="24"/>
-                <w:szCs w:val="24"/>
-              </w:rPr>
-              <w:t xml:space="preserve"> </w:t>
-            </w:r>
-            <w:proofErr w:type="spellStart"/>
-            <w:r>
-              <w:rPr>
-                <w:rFonts w:ascii="Times New Roman" w:eastAsia="Times New Roman" w:hAnsi="Times New Roman" w:cs="Times New Roman"/>
-                <w:sz w:val="24"/>
-                <w:szCs w:val="24"/>
-              </w:rPr>
-              <w:t>sinh</w:t>
-            </w:r>
-            <w:proofErr w:type="spellEnd"/>
-            <w:r>
-              <w:rPr>
-                <w:rFonts w:ascii="Times New Roman" w:eastAsia="Times New Roman" w:hAnsi="Times New Roman" w:cs="Times New Roman"/>
-                <w:sz w:val="24"/>
-                <w:szCs w:val="24"/>
-              </w:rPr>
-              <w:t xml:space="preserve"> </w:t>
-            </w:r>
-            <w:proofErr w:type="spellStart"/>
-            <w:r>
-              <w:rPr>
-                <w:rFonts w:ascii="Times New Roman" w:eastAsia="Times New Roman" w:hAnsi="Times New Roman" w:cs="Times New Roman"/>
-                <w:sz w:val="24"/>
-                <w:szCs w:val="24"/>
-              </w:rPr>
-              <w:t>được</w:t>
-            </w:r>
-            <w:proofErr w:type="spellEnd"/>
-            <w:r>
-              <w:rPr>
-                <w:rFonts w:ascii="Times New Roman" w:eastAsia="Times New Roman" w:hAnsi="Times New Roman" w:cs="Times New Roman"/>
-                <w:sz w:val="24"/>
-                <w:szCs w:val="24"/>
-              </w:rPr>
-              <w:t xml:space="preserve"> </w:t>
-            </w:r>
-            <w:proofErr w:type="spellStart"/>
-            <w:r>
-              <w:rPr>
-                <w:rFonts w:ascii="Times New Roman" w:eastAsia="Times New Roman" w:hAnsi="Times New Roman" w:cs="Times New Roman"/>
-                <w:sz w:val="24"/>
-                <w:szCs w:val="24"/>
-              </w:rPr>
-              <w:t>đánh</w:t>
-            </w:r>
-            <w:proofErr w:type="spellEnd"/>
-            <w:r>
-              <w:rPr>
-                <w:rFonts w:ascii="Times New Roman" w:eastAsia="Times New Roman" w:hAnsi="Times New Roman" w:cs="Times New Roman"/>
-                <w:sz w:val="24"/>
-                <w:szCs w:val="24"/>
-              </w:rPr>
-              <w:t xml:space="preserve"> </w:t>
-            </w:r>
-            <w:proofErr w:type="spellStart"/>
-            <w:r>
-              <w:rPr>
-                <w:rFonts w:ascii="Times New Roman" w:eastAsia="Times New Roman" w:hAnsi="Times New Roman" w:cs="Times New Roman"/>
-                <w:sz w:val="24"/>
-                <w:szCs w:val="24"/>
-              </w:rPr>
-              <w:t>giá</w:t>
-            </w:r>
-            <w:proofErr w:type="spellEnd"/>
           </w:p>
         </w:tc>
         <w:tc>
@@ -737,311 +303,13 @@
           <w:lang w:val="vi-VN"/>
         </w:rPr>
       </w:pPr>
-      <w:proofErr w:type="spellStart"/>
       <w:r>
         <w:rPr>
           <w:rFonts w:ascii="Times New Roman" w:eastAsia="Times New Roman" w:hAnsi="Times New Roman" w:cs="Times New Roman"/>
           <w:sz w:val="24"/>
           <w:szCs w:val="24"/>
         </w:rPr>
-        <w:t>Dữ</w:t>
-      </w:r>
-      <w:proofErr w:type="spellEnd"/>
-      <w:r>
-        <w:rPr>
-          <w:rFonts w:ascii="Times New Roman" w:eastAsia="Times New Roman" w:hAnsi="Times New Roman" w:cs="Times New Roman"/>
-          <w:sz w:val="24"/>
-          <w:szCs w:val="24"/>
-        </w:rPr>
-        <w:t xml:space="preserve"> </w:t>
-      </w:r>
-      <w:proofErr w:type="spellStart"/>
-      <w:r>
-        <w:rPr>
-          <w:rFonts w:ascii="Times New Roman" w:eastAsia="Times New Roman" w:hAnsi="Times New Roman" w:cs="Times New Roman"/>
-          <w:sz w:val="24"/>
-          <w:szCs w:val="24"/>
-        </w:rPr>
-        <w:t>liệu</w:t>
-      </w:r>
-      <w:proofErr w:type="spellEnd"/>
-      <w:r>
-        <w:rPr>
-          <w:rFonts w:ascii="Times New Roman" w:eastAsia="Times New Roman" w:hAnsi="Times New Roman" w:cs="Times New Roman"/>
-          <w:sz w:val="24"/>
-          <w:szCs w:val="24"/>
-        </w:rPr>
-        <w:t xml:space="preserve"> </w:t>
-      </w:r>
-      <w:proofErr w:type="spellStart"/>
-      <w:r>
-        <w:rPr>
-          <w:rFonts w:ascii="Times New Roman" w:eastAsia="Times New Roman" w:hAnsi="Times New Roman" w:cs="Times New Roman"/>
-          <w:sz w:val="24"/>
-          <w:szCs w:val="24"/>
-        </w:rPr>
-        <w:t>thu</w:t>
-      </w:r>
-      <w:proofErr w:type="spellEnd"/>
-      <w:r>
-        <w:rPr>
-          <w:rFonts w:ascii="Times New Roman" w:eastAsia="Times New Roman" w:hAnsi="Times New Roman" w:cs="Times New Roman"/>
-          <w:sz w:val="24"/>
-          <w:szCs w:val="24"/>
-        </w:rPr>
-        <w:t xml:space="preserve"> </w:t>
-      </w:r>
-      <w:proofErr w:type="spellStart"/>
-      <w:r>
-        <w:rPr>
-          <w:rFonts w:ascii="Times New Roman" w:eastAsia="Times New Roman" w:hAnsi="Times New Roman" w:cs="Times New Roman"/>
-          <w:sz w:val="24"/>
-          <w:szCs w:val="24"/>
-        </w:rPr>
-        <w:t>thập</w:t>
-      </w:r>
-      <w:proofErr w:type="spellEnd"/>
-      <w:r>
-        <w:rPr>
-          <w:rFonts w:ascii="Times New Roman" w:eastAsia="Times New Roman" w:hAnsi="Times New Roman" w:cs="Times New Roman"/>
-          <w:sz w:val="24"/>
-          <w:szCs w:val="24"/>
-        </w:rPr>
-        <w:t xml:space="preserve"> </w:t>
-      </w:r>
-      <w:proofErr w:type="spellStart"/>
-      <w:r>
-        <w:rPr>
-          <w:rFonts w:ascii="Times New Roman" w:eastAsia="Times New Roman" w:hAnsi="Times New Roman" w:cs="Times New Roman"/>
-          <w:sz w:val="24"/>
-          <w:szCs w:val="24"/>
-        </w:rPr>
-        <w:t>được</w:t>
-      </w:r>
-      <w:proofErr w:type="spellEnd"/>
-      <w:r>
-        <w:rPr>
-          <w:rFonts w:ascii="Times New Roman" w:eastAsia="Times New Roman" w:hAnsi="Times New Roman" w:cs="Times New Roman"/>
-          <w:sz w:val="24"/>
-          <w:szCs w:val="24"/>
-        </w:rPr>
-        <w:t xml:space="preserve"> </w:t>
-      </w:r>
-      <w:proofErr w:type="spellStart"/>
-      <w:r>
-        <w:rPr>
-          <w:rFonts w:ascii="Times New Roman" w:eastAsia="Times New Roman" w:hAnsi="Times New Roman" w:cs="Times New Roman"/>
-          <w:sz w:val="24"/>
-          <w:szCs w:val="24"/>
-        </w:rPr>
-        <w:t>về</w:t>
-      </w:r>
-      <w:proofErr w:type="spellEnd"/>
-      <w:r>
-        <w:rPr>
-          <w:rFonts w:ascii="Times New Roman" w:eastAsia="Times New Roman" w:hAnsi="Times New Roman" w:cs="Times New Roman"/>
-          <w:sz w:val="24"/>
-          <w:szCs w:val="24"/>
-        </w:rPr>
-        <w:t xml:space="preserve"> </w:t>
-      </w:r>
-      <w:proofErr w:type="spellStart"/>
-      <w:r>
-        <w:rPr>
-          <w:rFonts w:ascii="Times New Roman" w:eastAsia="Times New Roman" w:hAnsi="Times New Roman" w:cs="Times New Roman"/>
-          <w:sz w:val="24"/>
-          <w:szCs w:val="24"/>
-        </w:rPr>
-        <w:t>số</w:t>
-      </w:r>
-      <w:proofErr w:type="spellEnd"/>
-      <w:r>
-        <w:rPr>
-          <w:rFonts w:ascii="Times New Roman" w:eastAsia="Times New Roman" w:hAnsi="Times New Roman" w:cs="Times New Roman"/>
-          <w:sz w:val="24"/>
-          <w:szCs w:val="24"/>
-        </w:rPr>
-        <w:t xml:space="preserve"> </w:t>
-      </w:r>
-      <w:proofErr w:type="spellStart"/>
-      <w:r>
-        <w:rPr>
-          <w:rFonts w:ascii="Times New Roman" w:eastAsia="Times New Roman" w:hAnsi="Times New Roman" w:cs="Times New Roman"/>
-          <w:sz w:val="24"/>
-          <w:szCs w:val="24"/>
-        </w:rPr>
-        <w:t>học</w:t>
-      </w:r>
-      <w:proofErr w:type="spellEnd"/>
-      <w:r>
-        <w:rPr>
-          <w:rFonts w:ascii="Times New Roman" w:eastAsia="Times New Roman" w:hAnsi="Times New Roman" w:cs="Times New Roman"/>
-          <w:sz w:val="24"/>
-          <w:szCs w:val="24"/>
-        </w:rPr>
-        <w:t xml:space="preserve"> </w:t>
-      </w:r>
-      <w:proofErr w:type="spellStart"/>
-      <w:r>
-        <w:rPr>
-          <w:rFonts w:ascii="Times New Roman" w:eastAsia="Times New Roman" w:hAnsi="Times New Roman" w:cs="Times New Roman"/>
-          <w:sz w:val="24"/>
-          <w:szCs w:val="24"/>
-        </w:rPr>
-        <w:t>sinh</w:t>
-      </w:r>
-      <w:proofErr w:type="spellEnd"/>
-      <w:r>
-        <w:rPr>
-          <w:rFonts w:ascii="Times New Roman" w:eastAsia="Times New Roman" w:hAnsi="Times New Roman" w:cs="Times New Roman"/>
-          <w:sz w:val="24"/>
-          <w:szCs w:val="24"/>
-        </w:rPr>
-        <w:t xml:space="preserve"> </w:t>
-      </w:r>
-      <w:proofErr w:type="spellStart"/>
-      <w:r>
-        <w:rPr>
-          <w:rFonts w:ascii="Times New Roman" w:eastAsia="Times New Roman" w:hAnsi="Times New Roman" w:cs="Times New Roman"/>
-          <w:sz w:val="24"/>
-          <w:szCs w:val="24"/>
-        </w:rPr>
-        <w:t>được</w:t>
-      </w:r>
-      <w:proofErr w:type="spellEnd"/>
-      <w:r>
-        <w:rPr>
-          <w:rFonts w:ascii="Times New Roman" w:eastAsia="Times New Roman" w:hAnsi="Times New Roman" w:cs="Times New Roman"/>
-          <w:sz w:val="24"/>
-          <w:szCs w:val="24"/>
-        </w:rPr>
-        <w:t xml:space="preserve"> </w:t>
-      </w:r>
-      <w:proofErr w:type="spellStart"/>
-      <w:r>
-        <w:rPr>
-          <w:rFonts w:ascii="Times New Roman" w:eastAsia="Times New Roman" w:hAnsi="Times New Roman" w:cs="Times New Roman"/>
-          <w:sz w:val="24"/>
-          <w:szCs w:val="24"/>
-        </w:rPr>
-        <w:t>đánh</w:t>
-      </w:r>
-      <w:proofErr w:type="spellEnd"/>
-      <w:r>
-        <w:rPr>
-          <w:rFonts w:ascii="Times New Roman" w:eastAsia="Times New Roman" w:hAnsi="Times New Roman" w:cs="Times New Roman"/>
-          <w:sz w:val="24"/>
-          <w:szCs w:val="24"/>
-        </w:rPr>
-        <w:t xml:space="preserve"> </w:t>
-      </w:r>
-      <w:proofErr w:type="spellStart"/>
-      <w:r>
-        <w:rPr>
-          <w:rFonts w:ascii="Times New Roman" w:eastAsia="Times New Roman" w:hAnsi="Times New Roman" w:cs="Times New Roman"/>
-          <w:sz w:val="24"/>
-          <w:szCs w:val="24"/>
-        </w:rPr>
-        <w:t>giá</w:t>
-      </w:r>
-      <w:proofErr w:type="spellEnd"/>
-      <w:r>
-        <w:rPr>
-          <w:rFonts w:ascii="Times New Roman" w:eastAsia="Times New Roman" w:hAnsi="Times New Roman" w:cs="Times New Roman"/>
-          <w:sz w:val="24"/>
-          <w:szCs w:val="24"/>
-        </w:rPr>
-        <w:t xml:space="preserve"> ở </w:t>
-      </w:r>
-      <w:proofErr w:type="spellStart"/>
-      <w:r>
-        <w:rPr>
-          <w:rFonts w:ascii="Times New Roman" w:eastAsia="Times New Roman" w:hAnsi="Times New Roman" w:cs="Times New Roman"/>
-          <w:sz w:val="24"/>
-          <w:szCs w:val="24"/>
-        </w:rPr>
-        <w:t>bảng</w:t>
-      </w:r>
-      <w:proofErr w:type="spellEnd"/>
-      <w:r>
-        <w:rPr>
-          <w:rFonts w:ascii="Times New Roman" w:eastAsia="Times New Roman" w:hAnsi="Times New Roman" w:cs="Times New Roman"/>
-          <w:sz w:val="24"/>
-          <w:szCs w:val="24"/>
-        </w:rPr>
-        <w:t xml:space="preserve"> </w:t>
-      </w:r>
-      <w:proofErr w:type="spellStart"/>
-      <w:r>
-        <w:rPr>
-          <w:rFonts w:ascii="Times New Roman" w:eastAsia="Times New Roman" w:hAnsi="Times New Roman" w:cs="Times New Roman"/>
-          <w:sz w:val="24"/>
-          <w:szCs w:val="24"/>
-        </w:rPr>
-        <w:t>trên</w:t>
-      </w:r>
-      <w:proofErr w:type="spellEnd"/>
-      <w:r>
-        <w:rPr>
-          <w:rFonts w:ascii="Times New Roman" w:eastAsia="Times New Roman" w:hAnsi="Times New Roman" w:cs="Times New Roman"/>
-          <w:sz w:val="24"/>
-          <w:szCs w:val="24"/>
-        </w:rPr>
-        <w:t xml:space="preserve"> </w:t>
-      </w:r>
-      <w:proofErr w:type="spellStart"/>
-      <w:r>
-        <w:rPr>
-          <w:rFonts w:ascii="Times New Roman" w:eastAsia="Times New Roman" w:hAnsi="Times New Roman" w:cs="Times New Roman"/>
-          <w:sz w:val="24"/>
-          <w:szCs w:val="24"/>
-        </w:rPr>
-        <w:t>thuộc</w:t>
-      </w:r>
-      <w:proofErr w:type="spellEnd"/>
-      <w:r>
-        <w:rPr>
-          <w:rFonts w:ascii="Times New Roman" w:eastAsia="Times New Roman" w:hAnsi="Times New Roman" w:cs="Times New Roman"/>
-          <w:sz w:val="24"/>
-          <w:szCs w:val="24"/>
-        </w:rPr>
-        <w:t xml:space="preserve"> </w:t>
-      </w:r>
-      <w:proofErr w:type="spellStart"/>
-      <w:r>
-        <w:rPr>
-          <w:rFonts w:ascii="Times New Roman" w:eastAsia="Times New Roman" w:hAnsi="Times New Roman" w:cs="Times New Roman"/>
-          <w:sz w:val="24"/>
-          <w:szCs w:val="24"/>
-        </w:rPr>
-        <w:t>loại</w:t>
-      </w:r>
-      <w:proofErr w:type="spellEnd"/>
-      <w:r>
-        <w:rPr>
-          <w:rFonts w:ascii="Times New Roman" w:eastAsia="Times New Roman" w:hAnsi="Times New Roman" w:cs="Times New Roman"/>
-          <w:sz w:val="24"/>
-          <w:szCs w:val="24"/>
-        </w:rPr>
-        <w:t xml:space="preserve"> </w:t>
-      </w:r>
-      <w:proofErr w:type="spellStart"/>
-      <w:r>
-        <w:rPr>
-          <w:rFonts w:ascii="Times New Roman" w:eastAsia="Times New Roman" w:hAnsi="Times New Roman" w:cs="Times New Roman"/>
-          <w:sz w:val="24"/>
-          <w:szCs w:val="24"/>
-        </w:rPr>
-        <w:t>nào</w:t>
-      </w:r>
-      <w:proofErr w:type="spellEnd"/>
-      <w:r>
-        <w:rPr>
-          <w:rFonts w:ascii="Times New Roman" w:eastAsia="Times New Roman" w:hAnsi="Times New Roman" w:cs="Times New Roman"/>
-          <w:sz w:val="24"/>
-          <w:szCs w:val="24"/>
-        </w:rPr>
-        <w:t>?</w:t>
+        <w:t>Dữ liệu thu thập được về số học sinh được đánh giá ở bảng trên thuộc loại nào?</w:t>
       </w:r>
     </w:p>
     <w:p>
@@ -1086,226 +354,24 @@
           <w:sz w:val="24"/>
           <w:szCs w:val="24"/>
         </w:rPr>
-        <w:t>(</w:t>
-      </w:r>
-      <w:r>
-        <w:rPr>
-          <w:rFonts w:ascii="Times New Roman" w:eastAsia="Calibri" w:hAnsi="Times New Roman" w:cs="Times New Roman"/>
-          <w:b/>
-          <w:bCs/>
-          <w:color w:val="0000FF"/>
-          <w:sz w:val="24"/>
-          <w:szCs w:val="24"/>
-          <w:lang w:val="vi-VN"/>
-        </w:rPr>
-        <w:t>Đúng</w:t>
-      </w:r>
-      <w:r>
-        <w:rPr>
-          <w:rFonts w:ascii="Times New Roman" w:eastAsia="Calibri" w:hAnsi="Times New Roman" w:cs="Times New Roman"/>
-          <w:b/>
-          <w:bCs/>
-          <w:color w:val="0000FF"/>
-          <w:sz w:val="24"/>
-          <w:szCs w:val="24"/>
-        </w:rPr>
-        <w:t>)</w:t>
-      </w:r>
-      <w:r>
-        <w:rPr>
-          <w:rFonts w:ascii="Times New Roman" w:eastAsia="Calibri" w:hAnsi="Times New Roman" w:cs="Times New Roman"/>
-          <w:b/>
-          <w:bCs/>
-          <w:color w:val="0000FF"/>
-          <w:sz w:val="24"/>
-          <w:szCs w:val="24"/>
-          <w:lang w:val="vi-VN"/>
-        </w:rPr>
-        <w:t xml:space="preserve"> </w:t>
-      </w:r>
-      <w:r>
-        <w:rPr>
-          <w:rFonts w:ascii="Times New Roman" w:eastAsia="Calibri" w:hAnsi="Times New Roman" w:cs="Times New Roman"/>
-          <w:b/>
-          <w:bCs/>
-          <w:color w:val="0000FF"/>
-          <w:sz w:val="24"/>
-          <w:szCs w:val="24"/>
-        </w:rPr>
         <w:t xml:space="preserve">A. </w:t>
       </w:r>
-      <w:proofErr w:type="spellStart"/>
       <w:r>
         <w:rPr>
           <w:rFonts w:ascii="Times New Roman" w:hAnsi="Times New Roman" w:cs="Times New Roman"/>
           <w:sz w:val="24"/>
           <w:szCs w:val="24"/>
         </w:rPr>
-        <w:t>Dữ</w:t>
+        <w:t xml:space="preserve">Dữ liệu không là số, không thể sắp thứ </w:t>
       </w:r>
-      <w:proofErr w:type="spellEnd"/>
       <w:r>
         <w:rPr>
           <w:rFonts w:ascii="Times New Roman" w:hAnsi="Times New Roman" w:cs="Times New Roman"/>
           <w:sz w:val="24"/>
           <w:szCs w:val="24"/>
         </w:rPr>
-        <w:t xml:space="preserve"> </w:t>
-      </w:r>
-      <w:proofErr w:type="spellStart"/>
-      <w:r>
-        <w:rPr>
-          <w:rFonts w:ascii="Times New Roman" w:hAnsi="Times New Roman" w:cs="Times New Roman"/>
-          <w:sz w:val="24"/>
-          <w:szCs w:val="24"/>
-        </w:rPr>
-        <w:t>liệu</w:t>
-      </w:r>
-      <w:proofErr w:type="spellEnd"/>
-      <w:r>
-        <w:rPr>
-          <w:rFonts w:ascii="Times New Roman" w:hAnsi="Times New Roman" w:cs="Times New Roman"/>
-          <w:sz w:val="24"/>
-          <w:szCs w:val="24"/>
-        </w:rPr>
-        <w:t xml:space="preserve"> </w:t>
-      </w:r>
-      <w:proofErr w:type="spellStart"/>
-      <w:r>
-        <w:rPr>
-          <w:rFonts w:ascii="Times New Roman" w:hAnsi="Times New Roman" w:cs="Times New Roman"/>
-          <w:sz w:val="24"/>
-          <w:szCs w:val="24"/>
-        </w:rPr>
-        <w:t>không</w:t>
-      </w:r>
-      <w:proofErr w:type="spellEnd"/>
-      <w:r>
-        <w:rPr>
-          <w:rFonts w:ascii="Times New Roman" w:hAnsi="Times New Roman" w:cs="Times New Roman"/>
-          <w:sz w:val="24"/>
-          <w:szCs w:val="24"/>
-        </w:rPr>
-        <w:t xml:space="preserve"> </w:t>
-      </w:r>
-      <w:proofErr w:type="spellStart"/>
-      <w:r>
-        <w:rPr>
-          <w:rFonts w:ascii="Times New Roman" w:hAnsi="Times New Roman" w:cs="Times New Roman"/>
-          <w:sz w:val="24"/>
-          <w:szCs w:val="24"/>
-        </w:rPr>
-        <w:t>là</w:t>
-      </w:r>
-      <w:proofErr w:type="spellEnd"/>
-      <w:r>
-        <w:rPr>
-          <w:rFonts w:ascii="Times New Roman" w:hAnsi="Times New Roman" w:cs="Times New Roman"/>
-          <w:sz w:val="24"/>
-          <w:szCs w:val="24"/>
-        </w:rPr>
-        <w:t xml:space="preserve"> </w:t>
-      </w:r>
-      <w:proofErr w:type="spellStart"/>
-      <w:r>
-        <w:rPr>
-          <w:rFonts w:ascii="Times New Roman" w:hAnsi="Times New Roman" w:cs="Times New Roman"/>
-          <w:sz w:val="24"/>
-          <w:szCs w:val="24"/>
-        </w:rPr>
-        <w:t>số</w:t>
-      </w:r>
-      <w:proofErr w:type="spellEnd"/>
-      <w:r>
-        <w:rPr>
-          <w:rFonts w:ascii="Times New Roman" w:hAnsi="Times New Roman" w:cs="Times New Roman"/>
-          <w:sz w:val="24"/>
-          <w:szCs w:val="24"/>
-        </w:rPr>
-        <w:t xml:space="preserve">, </w:t>
-      </w:r>
-      <w:proofErr w:type="spellStart"/>
-      <w:r>
-        <w:rPr>
-          <w:rFonts w:ascii="Times New Roman" w:hAnsi="Times New Roman" w:cs="Times New Roman"/>
-          <w:sz w:val="24"/>
-          <w:szCs w:val="24"/>
-        </w:rPr>
-        <w:t>không</w:t>
-      </w:r>
-      <w:proofErr w:type="spellEnd"/>
-      <w:r>
-        <w:rPr>
-          <w:rFonts w:ascii="Times New Roman" w:hAnsi="Times New Roman" w:cs="Times New Roman"/>
-          <w:sz w:val="24"/>
-          <w:szCs w:val="24"/>
-        </w:rPr>
-        <w:t xml:space="preserve"> </w:t>
-      </w:r>
-      <w:proofErr w:type="spellStart"/>
-      <w:r>
-        <w:rPr>
-          <w:rFonts w:ascii="Times New Roman" w:hAnsi="Times New Roman" w:cs="Times New Roman"/>
-          <w:sz w:val="24"/>
-          <w:szCs w:val="24"/>
-        </w:rPr>
-        <w:t>thể</w:t>
-      </w:r>
-      <w:proofErr w:type="spellEnd"/>
-      <w:r>
-        <w:rPr>
-          <w:rFonts w:ascii="Times New Roman" w:hAnsi="Times New Roman" w:cs="Times New Roman"/>
-          <w:sz w:val="24"/>
-          <w:szCs w:val="24"/>
-        </w:rPr>
-        <w:t xml:space="preserve"> </w:t>
-      </w:r>
-      <w:proofErr w:type="spellStart"/>
-      <w:r>
-        <w:rPr>
-          <w:rFonts w:ascii="Times New Roman" w:hAnsi="Times New Roman" w:cs="Times New Roman"/>
-          <w:sz w:val="24"/>
-          <w:szCs w:val="24"/>
-        </w:rPr>
-        <w:t>sắp</w:t>
-      </w:r>
-      <w:proofErr w:type="spellEnd"/>
-      <w:r>
-        <w:rPr>
-          <w:rFonts w:ascii="Times New Roman" w:hAnsi="Times New Roman" w:cs="Times New Roman"/>
-          <w:sz w:val="24"/>
-          <w:szCs w:val="24"/>
-        </w:rPr>
-        <w:t xml:space="preserve"> </w:t>
-      </w:r>
-      <w:proofErr w:type="spellStart"/>
-      <w:r>
-        <w:rPr>
-          <w:rFonts w:ascii="Times New Roman" w:hAnsi="Times New Roman" w:cs="Times New Roman"/>
-          <w:sz w:val="24"/>
-          <w:szCs w:val="24"/>
-        </w:rPr>
-        <w:t>thứ</w:t>
-      </w:r>
-      <w:proofErr w:type="spellEnd"/>
-      <w:r>
-        <w:rPr>
-          <w:rFonts w:ascii="Times New Roman" w:hAnsi="Times New Roman" w:cs="Times New Roman"/>
-          <w:sz w:val="24"/>
-          <w:szCs w:val="24"/>
-        </w:rPr>
-        <w:t xml:space="preserve"> </w:t>
-      </w:r>
-      <w:proofErr w:type="spellStart"/>
-      <w:r>
-        <w:rPr>
-          <w:rFonts w:ascii="Times New Roman" w:hAnsi="Times New Roman" w:cs="Times New Roman"/>
-          <w:sz w:val="24"/>
-          <w:szCs w:val="24"/>
-        </w:rPr>
         <w:t>tự</w:t>
       </w:r>
-      <w:proofErr w:type="spellEnd"/>
     </w:p>
     <w:p>
       <w:pPr>
@@ -1331,193 +397,17 @@
           <w:color w:val="0000FF"/>
           <w:sz w:val="24"/>
           <w:szCs w:val="24"/>
-          <w:lang w:val="vi-VN"/>
-        </w:rPr>
-        <w:t xml:space="preserve">(Sai) </w:t>
-      </w:r>
-      <w:r>
-        <w:rPr>
-          <w:rFonts w:ascii="Times New Roman" w:eastAsia="Calibri" w:hAnsi="Times New Roman" w:cs="Times New Roman"/>
-          <w:b/>
-          <w:bCs/>
-          <w:color w:val="0000FF"/>
-          <w:sz w:val="24"/>
-          <w:szCs w:val="24"/>
         </w:rPr>
         <w:t xml:space="preserve">B. </w:t>
       </w:r>
-      <w:proofErr w:type="spellStart"/>
       <w:r>
         <w:rPr>
           <w:rFonts w:ascii="Times New Roman" w:hAnsi="Times New Roman" w:cs="Times New Roman"/>
           <w:sz w:val="24"/>
           <w:szCs w:val="24"/>
         </w:rPr>
-        <w:t>Dữ</w:t>
+        <w:t>Dữ liệu không là số, có thể sắp thứ tự</w:t>
       </w:r>
-      <w:proofErr w:type="spellEnd"/>
-      <w:r>
-        <w:rPr>
-          <w:rFonts w:ascii="Times New Roman" w:hAnsi="Times New Roman" w:cs="Times New Roman"/>
-          <w:sz w:val="24"/>
-          <w:szCs w:val="24"/>
-        </w:rPr>
-        <w:t xml:space="preserve"> </w:t>
-      </w:r>
-      <w:proofErr w:type="spellStart"/>
-      <w:r>
-        <w:rPr>
-          <w:rFonts w:ascii="Times New Roman" w:hAnsi="Times New Roman" w:cs="Times New Roman"/>
-          <w:sz w:val="24"/>
-          <w:szCs w:val="24"/>
-        </w:rPr>
-        <w:t>liệu</w:t>
-      </w:r>
-      <w:proofErr w:type="spellEnd"/>
-      <w:r>
-        <w:rPr>
-          <w:rFonts w:ascii="Times New Roman" w:hAnsi="Times New Roman" w:cs="Times New Roman"/>
-          <w:sz w:val="24"/>
-          <w:szCs w:val="24"/>
-        </w:rPr>
-        <w:t xml:space="preserve"> </w:t>
-      </w:r>
-      <w:proofErr w:type="spellStart"/>
-      <w:r>
-        <w:rPr>
-          <w:rFonts w:ascii="Times New Roman" w:hAnsi="Times New Roman" w:cs="Times New Roman"/>
-          <w:sz w:val="24"/>
-          <w:szCs w:val="24"/>
-        </w:rPr>
-        <w:t>không</w:t>
-      </w:r>
-      <w:proofErr w:type="spellEnd"/>
-      <w:r>
-        <w:rPr>
-          <w:rFonts w:ascii="Times New Roman" w:hAnsi="Times New Roman" w:cs="Times New Roman"/>
-          <w:sz w:val="24"/>
-          <w:szCs w:val="24"/>
-        </w:rPr>
-        <w:t xml:space="preserve"> </w:t>
-      </w:r>
-      <w:proofErr w:type="spellStart"/>
-      <w:r>
-        <w:rPr>
-          <w:rFonts w:ascii="Times New Roman" w:hAnsi="Times New Roman" w:cs="Times New Roman"/>
-          <w:sz w:val="24"/>
-          <w:szCs w:val="24"/>
-        </w:rPr>
-        <w:t>là</w:t>
-      </w:r>
-      <w:proofErr w:type="spellEnd"/>
-      <w:r>
-        <w:rPr>
-          <w:rFonts w:ascii="Times New Roman" w:hAnsi="Times New Roman" w:cs="Times New Roman"/>
-          <w:sz w:val="24"/>
-          <w:szCs w:val="24"/>
-        </w:rPr>
-        <w:t xml:space="preserve"> </w:t>
-      </w:r>
-      <w:proofErr w:type="spellStart"/>
-      <w:r>
-        <w:rPr>
-          <w:rFonts w:ascii="Times New Roman" w:hAnsi="Times New Roman" w:cs="Times New Roman"/>
-          <w:sz w:val="24"/>
-          <w:szCs w:val="24"/>
-        </w:rPr>
-        <w:t>số</w:t>
-      </w:r>
-      <w:proofErr w:type="spellEnd"/>
-      <w:r>
-        <w:rPr>
-          <w:rFonts w:ascii="Times New Roman" w:hAnsi="Times New Roman" w:cs="Times New Roman"/>
-          <w:sz w:val="24"/>
-          <w:szCs w:val="24"/>
-        </w:rPr>
-        <w:t xml:space="preserve">, </w:t>
-      </w:r>
-      <w:proofErr w:type="spellStart"/>
-      <w:r>
-        <w:rPr>
-          <w:rFonts w:ascii="Times New Roman" w:hAnsi="Times New Roman" w:cs="Times New Roman"/>
-          <w:sz w:val="24"/>
-          <w:szCs w:val="24"/>
-        </w:rPr>
-        <w:t>có</w:t>
-      </w:r>
-      <w:proofErr w:type="spellEnd"/>
-      <w:r>
-        <w:rPr>
-          <w:rFonts w:ascii="Times New Roman" w:hAnsi="Times New Roman" w:cs="Times New Roman"/>
-          <w:sz w:val="24"/>
-          <w:szCs w:val="24"/>
-        </w:rPr>
-        <w:t xml:space="preserve"> </w:t>
-      </w:r>
-      <w:proofErr w:type="spellStart"/>
-      <w:r>
-        <w:rPr>
-          <w:rFonts w:ascii="Times New Roman" w:hAnsi="Times New Roman" w:cs="Times New Roman"/>
-          <w:sz w:val="24"/>
-          <w:szCs w:val="24"/>
-        </w:rPr>
-        <w:t>thể</w:t>
-      </w:r>
-      <w:proofErr w:type="spellEnd"/>
-      <w:r>
-        <w:rPr>
-          <w:rFonts w:ascii="Times New Roman" w:hAnsi="Times New Roman" w:cs="Times New Roman"/>
-          <w:sz w:val="24"/>
-          <w:szCs w:val="24"/>
-        </w:rPr>
-        <w:t xml:space="preserve"> </w:t>
-      </w:r>
-      <w:proofErr w:type="spellStart"/>
-      <w:r>
-        <w:rPr>
-          <w:rFonts w:ascii="Times New Roman" w:hAnsi="Times New Roman" w:cs="Times New Roman"/>
-          <w:sz w:val="24"/>
-          <w:szCs w:val="24"/>
-        </w:rPr>
-        <w:t>sắp</w:t>
-      </w:r>
-      <w:proofErr w:type="spellEnd"/>
-      <w:r>
-        <w:rPr>
-          <w:rFonts w:ascii="Times New Roman" w:hAnsi="Times New Roman" w:cs="Times New Roman"/>
-          <w:sz w:val="24"/>
-          <w:szCs w:val="24"/>
-        </w:rPr>
-        <w:t xml:space="preserve"> </w:t>
-      </w:r>
-      <w:proofErr w:type="spellStart"/>
-      <w:r>
-        <w:rPr>
-          <w:rFonts w:ascii="Times New Roman" w:hAnsi="Times New Roman" w:cs="Times New Roman"/>
-          <w:sz w:val="24"/>
-          <w:szCs w:val="24"/>
-        </w:rPr>
-        <w:t>thứ</w:t>
-      </w:r>
-      <w:proofErr w:type="spellEnd"/>
-      <w:r>
-        <w:rPr>
-          <w:rFonts w:ascii="Times New Roman" w:hAnsi="Times New Roman" w:cs="Times New Roman"/>
-          <w:sz w:val="24"/>
-          <w:szCs w:val="24"/>
-        </w:rPr>
-        <w:t xml:space="preserve"> </w:t>
-      </w:r>
-      <w:proofErr w:type="spellStart"/>
-      <w:r>
-        <w:rPr>
-          <w:rFonts w:ascii="Times New Roman" w:hAnsi="Times New Roman" w:cs="Times New Roman"/>
-          <w:sz w:val="24"/>
-          <w:szCs w:val="24"/>
-        </w:rPr>
-        <w:t>tự</w:t>
-      </w:r>
-      <w:proofErr w:type="spellEnd"/>
     </w:p>
     <w:p>
       <w:pPr>
@@ -1543,9 +433,8 @@
           <w:color w:val="0000FF"/>
           <w:sz w:val="24"/>
           <w:szCs w:val="24"/>
-          <w:lang w:val="vi-VN"/>
-        </w:rPr>
-        <w:t xml:space="preserve">(Sai) </w:t>
+        </w:rPr>
+        <w:t>C.</w:t>
       </w:r>
       <w:r>
         <w:rPr>
@@ -1556,83 +445,24 @@
           <w:sz w:val="24"/>
           <w:szCs w:val="24"/>
         </w:rPr>
-        <w:t>C.</w:t>
-      </w:r>
-      <w:r>
-        <w:rPr>
-          <w:rFonts w:ascii="Times New Roman" w:eastAsia="Calibri" w:hAnsi="Times New Roman" w:cs="Times New Roman"/>
-          <w:b/>
-          <w:bCs/>
-          <w:color w:val="0000FF"/>
-          <w:sz w:val="24"/>
-          <w:szCs w:val="24"/>
-        </w:rPr>
         <w:t xml:space="preserve"> </w:t>
       </w:r>
-      <w:proofErr w:type="spellStart"/>
       <w:r>
         <w:rPr>
           <w:rFonts w:ascii="Times New Roman" w:hAnsi="Times New Roman" w:cs="Times New Roman"/>
           <w:sz w:val="24"/>
           <w:szCs w:val="24"/>
         </w:rPr>
-        <w:t>Dữ</w:t>
+        <w:t xml:space="preserve">Dữ liệu định </w:t>
       </w:r>
-      <w:proofErr w:type="spellEnd"/>
       <w:r>
         <w:rPr>
           <w:rFonts w:ascii="Times New Roman" w:hAnsi="Times New Roman" w:cs="Times New Roman"/>
           <w:sz w:val="24"/>
           <w:szCs w:val="24"/>
         </w:rPr>
-        <w:t xml:space="preserve"> </w:t>
-      </w:r>
-      <w:proofErr w:type="spellStart"/>
-      <w:r>
-        <w:rPr>
-          <w:rFonts w:ascii="Times New Roman" w:hAnsi="Times New Roman" w:cs="Times New Roman"/>
-          <w:sz w:val="24"/>
-          <w:szCs w:val="24"/>
-        </w:rPr>
-        <w:t>liệu</w:t>
-      </w:r>
-      <w:proofErr w:type="spellEnd"/>
-      <w:r>
-        <w:rPr>
-          <w:rFonts w:ascii="Times New Roman" w:hAnsi="Times New Roman" w:cs="Times New Roman"/>
-          <w:sz w:val="24"/>
-          <w:szCs w:val="24"/>
-        </w:rPr>
-        <w:t xml:space="preserve"> </w:t>
-      </w:r>
-      <w:proofErr w:type="spellStart"/>
-      <w:r>
-        <w:rPr>
-          <w:rFonts w:ascii="Times New Roman" w:hAnsi="Times New Roman" w:cs="Times New Roman"/>
-          <w:sz w:val="24"/>
-          <w:szCs w:val="24"/>
-        </w:rPr>
-        <w:t>định</w:t>
-      </w:r>
-      <w:proofErr w:type="spellEnd"/>
-      <w:r>
-        <w:rPr>
-          <w:rFonts w:ascii="Times New Roman" w:hAnsi="Times New Roman" w:cs="Times New Roman"/>
-          <w:sz w:val="24"/>
-          <w:szCs w:val="24"/>
-        </w:rPr>
-        <w:t xml:space="preserve"> </w:t>
-      </w:r>
-      <w:proofErr w:type="spellStart"/>
-      <w:r>
-        <w:rPr>
-          <w:rFonts w:ascii="Times New Roman" w:hAnsi="Times New Roman" w:cs="Times New Roman"/>
-          <w:sz w:val="24"/>
-          <w:szCs w:val="24"/>
-        </w:rPr>
         <w:t>tính</w:t>
       </w:r>
-      <w:proofErr w:type="spellEnd"/>
     </w:p>
     <w:p>
       <w:pPr>
@@ -1644,9 +474,7 @@
         <w:spacing w:before="60" w:after="60"/>
         <w:jc w:val="both"/>
         <w:rPr>
-          <w:rFonts w:ascii="Times New Roman" w:hAnsi="Times New Roman" w:cs="Times New Roman"/>
-          <w:sz w:val="24"/>
-          <w:szCs w:val="24"/>
+          <w:lang w:val="vi-VN"/>
         </w:rPr>
       </w:pPr>
       <w:r>
@@ -1657,132 +485,16 @@
           <w:color w:val="0000FF"/>
           <w:sz w:val="24"/>
           <w:szCs w:val="24"/>
-          <w:lang w:val="vi-VN"/>
-        </w:rPr>
-        <w:t xml:space="preserve">(Sai) </w:t>
-      </w:r>
-      <w:r>
-        <w:rPr>
-          <w:rFonts w:ascii="Times New Roman" w:eastAsia="Calibri" w:hAnsi="Times New Roman" w:cs="Times New Roman"/>
-          <w:b/>
-          <w:bCs/>
-          <w:color w:val="0000FF"/>
-          <w:sz w:val="24"/>
-          <w:szCs w:val="24"/>
         </w:rPr>
         <w:t xml:space="preserve">D. </w:t>
       </w:r>
-      <w:proofErr w:type="spellStart"/>
       <w:r>
         <w:rPr>
           <w:rFonts w:ascii="Times New Roman" w:hAnsi="Times New Roman" w:cs="Times New Roman"/>
           <w:sz w:val="24"/>
           <w:szCs w:val="24"/>
         </w:rPr>
-        <w:t>Dữ</w:t>
-      </w:r>
-      <w:proofErr w:type="spellEnd"/>
-      <w:r>
-        <w:rPr>
-          <w:rFonts w:ascii="Times New Roman" w:hAnsi="Times New Roman" w:cs="Times New Roman"/>
-          <w:sz w:val="24"/>
-          <w:szCs w:val="24"/>
-        </w:rPr>
-        <w:t xml:space="preserve"> </w:t>
-      </w:r>
-      <w:proofErr w:type="spellStart"/>
-      <w:r>
-        <w:rPr>
-          <w:rFonts w:ascii="Times New Roman" w:hAnsi="Times New Roman" w:cs="Times New Roman"/>
-          <w:sz w:val="24"/>
-          <w:szCs w:val="24"/>
-        </w:rPr>
-        <w:t>liệu</w:t>
-      </w:r>
-      <w:proofErr w:type="spellEnd"/>
-      <w:r>
-        <w:rPr>
-          <w:rFonts w:ascii="Times New Roman" w:hAnsi="Times New Roman" w:cs="Times New Roman"/>
-          <w:sz w:val="24"/>
-          <w:szCs w:val="24"/>
-        </w:rPr>
-        <w:t xml:space="preserve"> </w:t>
-      </w:r>
-      <w:proofErr w:type="spellStart"/>
-      <w:r>
-        <w:rPr>
-          <w:rFonts w:ascii="Times New Roman" w:hAnsi="Times New Roman" w:cs="Times New Roman"/>
-          <w:sz w:val="24"/>
-          <w:szCs w:val="24"/>
-        </w:rPr>
-        <w:t>không</w:t>
-      </w:r>
-      <w:proofErr w:type="spellEnd"/>
-      <w:r>
-        <w:rPr>
-          <w:rFonts w:ascii="Times New Roman" w:hAnsi="Times New Roman" w:cs="Times New Roman"/>
-          <w:sz w:val="24"/>
-          <w:szCs w:val="24"/>
-        </w:rPr>
-        <w:t xml:space="preserve"> </w:t>
-      </w:r>
-      <w:proofErr w:type="spellStart"/>
-      <w:r>
-        <w:rPr>
-          <w:rFonts w:ascii="Times New Roman" w:hAnsi="Times New Roman" w:cs="Times New Roman"/>
-          <w:sz w:val="24"/>
-          <w:szCs w:val="24"/>
-        </w:rPr>
-        <w:t>là</w:t>
-      </w:r>
-      <w:proofErr w:type="spellEnd"/>
-      <w:r>
-        <w:rPr>
-          <w:rFonts w:ascii="Times New Roman" w:hAnsi="Times New Roman" w:cs="Times New Roman"/>
-          <w:sz w:val="24"/>
-          <w:szCs w:val="24"/>
-        </w:rPr>
-        <w:t xml:space="preserve"> </w:t>
-      </w:r>
-      <w:proofErr w:type="spellStart"/>
-      <w:r>
-        <w:rPr>
-          <w:rFonts w:ascii="Times New Roman" w:hAnsi="Times New Roman" w:cs="Times New Roman"/>
-          <w:sz w:val="24"/>
-          <w:szCs w:val="24"/>
-        </w:rPr>
-        <w:t>số</w:t>
-      </w:r>
-      <w:proofErr w:type="spellEnd"/>
-      <w:r>
-        <w:rPr>
-          <w:rFonts w:ascii="Times New Roman" w:hAnsi="Times New Roman" w:cs="Times New Roman"/>
-          <w:sz w:val="24"/>
-          <w:szCs w:val="24"/>
-        </w:rPr>
-        <w:t xml:space="preserve">    </w:t>
-      </w:r>
-    </w:p>
-    <w:p>
-      <w:pPr>
-        <w:rPr>
-          <w:lang w:val="vi-VN"/>
-        </w:rPr>
-      </w:pPr>
-      <w:r>
-        <w:rPr>
-          <w:b/>
-          <w:bCs/>
-          <w:lang w:val="vi-VN"/>
-        </w:rPr>
-        <w:t>Giải thích:</w:t>
-      </w:r>
-      <w:r>
-        <w:rPr>
-          <w:lang w:val="vi-VN"/>
-        </w:rPr>
-        <w:br/>
-        <w:t>aaaaaaaaa</w:t>
+        <w:t>Dữ liệu không là số</w:t>
       </w:r>
     </w:p>
     <w:sectPr>

</xml_diff>